<commit_message>
Scene grouping , new scenes
</commit_message>
<xml_diff>
--- a/Writing/Final/Literature Review/Full Lit review.docx
+++ b/Writing/Final/Literature Review/Full Lit review.docx
@@ -3087,6 +3087,12 @@
           <w:color w:val="FF0000"/>
         </w:rPr>
       </w:pPr>
+      <w:r>
+        <w:rPr>
+          <w:color w:val="FF0000"/>
+        </w:rPr>
+        <w:t>file:///C:/Users/Joshua%20Pretorius/Documents/Dual-polarimetric_Sentinel-1_SAR_Backscattering_Features_from_Green_Macroalgae_Floating_in_the_Coastal_Ocean.pdf</w:t>
+      </w:r>
     </w:p>
     <w:p>
       <w:pPr>
@@ -9076,6 +9082,7 @@
   <w:style w:type="character" w:default="1" w:styleId="DefaultParagraphFont">
     <w:name w:val="Default Paragraph Font"/>
     <w:uiPriority w:val="1"/>
+    <w:semiHidden/>
     <w:unhideWhenUsed/>
   </w:style>
   <w:style w:type="table" w:default="1" w:styleId="TableNormal">

</xml_diff>